<commit_message>
Word documents: table cell borders and backgrounds
- Model: RichBorder per cell side, RichTableCell::backgroundColor,
  RichDocBlock::tableBordersFromDocument.
- ODT (cell styles, column default cell style), DOCX (table style chain,
  w:tblBorders, w:tcBorders, w:shd) and DOC (TC80, sprmTTableBorders(80),
  sprmTSetBrc(80), sprmTDefTableShd(80)) readers fill them.
- UltraCanvasRichTextEdit draws document frames and fills with abutting
  rows; borderless cells get faint guides only when editable.
- ODT/DOCX writers and HTML output carry the frames; Markdown tables get a
  thin grid in ODT too. Inserted rows/columns copy their neighbour's frame.
- Fixture gains a framed table (fill, thick coloured line) and a borderless
  layout table; tests cover all three readers, both writers and the editor.

Co-Authored-By: Claude Opus 5.5 <noreply@anthropic.com>
Claude-Session: https://claude.ai/code/session_01XRKLeqdGGwmZ4Cgz4KJXAZ
</commit_message>
<xml_diff>
--- a/Tests/fixtures/word97-formatting.docx
+++ b/Tests/fixtures/word97-formatting.docx
@@ -295,7 +295,7 @@
       <w:tblPr>
         <w:tblW w:w="8640" w:type="dxa"/>
         <w:jc w:val="start"/>
-        <w:tblInd w:w="0" w:type="dxa"/>
+        <w:tblInd w:w="-5" w:type="dxa"/>
         <w:tblLayout w:type="fixed"/>
         <w:tblCellMar>
           <w:top w:w="0" w:type="dxa"/>
@@ -315,7 +315,13 @@
         <w:tc>
           <w:tcPr>
             <w:tcW w:w="2160" w:type="dxa"/>
-            <w:tcBorders/>
+            <w:tcBorders>
+              <w:top w:val="single" w:sz="4" w:space="0" w:color="000000"/>
+              <w:start w:val="single" w:sz="4" w:space="0" w:color="000000"/>
+              <w:bottom w:val="single" w:sz="4" w:space="0" w:color="000000"/>
+              <w:end w:val="single" w:sz="4" w:space="0" w:color="000000"/>
+            </w:tcBorders>
+            <w:shd w:fill="DDEEFF" w:val="clear"/>
           </w:tcPr>
           <w:p>
             <w:pPr>
@@ -333,7 +339,13 @@
         <w:tc>
           <w:tcPr>
             <w:tcW w:w="6480" w:type="dxa"/>
-            <w:tcBorders/>
+            <w:tcBorders>
+              <w:top w:val="single" w:sz="4" w:space="0" w:color="000000"/>
+              <w:start w:val="single" w:sz="4" w:space="0" w:color="000000"/>
+              <w:bottom w:val="single" w:sz="4" w:space="0" w:color="000000"/>
+              <w:end w:val="single" w:sz="4" w:space="0" w:color="000000"/>
+            </w:tcBorders>
+            <w:shd w:fill="DDEEFF" w:val="clear"/>
           </w:tcPr>
           <w:p>
             <w:pPr>
@@ -354,7 +366,12 @@
         <w:tc>
           <w:tcPr>
             <w:tcW w:w="2160" w:type="dxa"/>
-            <w:tcBorders/>
+            <w:tcBorders>
+              <w:top w:val="single" w:sz="4" w:space="0" w:color="000000"/>
+              <w:start w:val="single" w:sz="4" w:space="0" w:color="000000"/>
+              <w:bottom w:val="single" w:sz="4" w:space="0" w:color="000000"/>
+              <w:end w:val="single" w:sz="4" w:space="0" w:color="000000"/>
+            </w:tcBorders>
           </w:tcPr>
           <w:p>
             <w:pPr>
@@ -372,7 +389,12 @@
         <w:tc>
           <w:tcPr>
             <w:tcW w:w="6480" w:type="dxa"/>
-            <w:tcBorders/>
+            <w:tcBorders>
+              <w:top w:val="single" w:sz="4" w:space="0" w:color="000000"/>
+              <w:start w:val="single" w:sz="4" w:space="0" w:color="000000"/>
+              <w:bottom w:val="single" w:sz="4" w:space="0" w:color="000000"/>
+              <w:end w:val="single" w:sz="4" w:space="0" w:color="000000"/>
+            </w:tcBorders>
           </w:tcPr>
           <w:p>
             <w:pPr>
@@ -393,6 +415,73 @@
         <w:tc>
           <w:tcPr>
             <w:tcW w:w="2160" w:type="dxa"/>
+            <w:tcBorders>
+              <w:top w:val="single" w:sz="4" w:space="0" w:color="000000"/>
+              <w:start w:val="single" w:sz="4" w:space="0" w:color="000000"/>
+              <w:bottom w:val="single" w:sz="4" w:space="0" w:color="000000"/>
+              <w:end w:val="single" w:sz="4" w:space="0" w:color="000000"/>
+            </w:tcBorders>
+          </w:tcPr>
+          <w:p>
+            <w:pPr>
+              <w:pStyle w:val="Normal"/>
+              <w:bidi w:val="0"/>
+              <w:jc w:val="start"/>
+              <w:rPr/>
+            </w:pPr>
+            <w:r>
+              <w:rPr/>
+              <w:t>2.2.2026</w:t>
+            </w:r>
+          </w:p>
+        </w:tc>
+        <w:tc>
+          <w:tcPr>
+            <w:tcW w:w="6480" w:type="dxa"/>
+            <w:tcBorders>
+              <w:top w:val="single" w:sz="4" w:space="0" w:color="000000"/>
+              <w:start w:val="single" w:sz="4" w:space="0" w:color="000000"/>
+              <w:bottom w:val="single" w:sz="16" w:space="0" w:color="0000FF"/>
+              <w:end w:val="single" w:sz="4" w:space="0" w:color="000000"/>
+            </w:tcBorders>
+          </w:tcPr>
+          <w:p>
+            <w:pPr>
+              <w:pStyle w:val="Normal"/>
+              <w:bidi w:val="0"/>
+              <w:jc w:val="end"/>
+              <w:rPr/>
+            </w:pPr>
+            <w:r>
+              <w:rPr/>
+              <w:t>250.50</w:t>
+            </w:r>
+          </w:p>
+        </w:tc>
+      </w:tr>
+    </w:tbl>
+    <w:tbl>
+      <w:tblPr>
+        <w:tblW w:w="5000" w:type="pct"/>
+        <w:jc w:val="start"/>
+        <w:tblInd w:w="0" w:type="dxa"/>
+        <w:tblLayout w:type="fixed"/>
+        <w:tblCellMar>
+          <w:top w:w="0" w:type="dxa"/>
+          <w:start w:w="0" w:type="dxa"/>
+          <w:bottom w:w="0" w:type="dxa"/>
+          <w:end w:w="0" w:type="dxa"/>
+        </w:tblCellMar>
+      </w:tblPr>
+      <w:tblGrid>
+        <w:gridCol w:w="4818"/>
+        <w:gridCol w:w="4820"/>
+      </w:tblGrid>
+      <w:tr>
+        <w:trPr/>
+        <w:tc>
+          <w:tcPr>
+            <w:tcW w:w="4818" w:type="dxa"/>
             <w:tcBorders/>
           </w:tcPr>
           <w:p>
@@ -404,25 +493,25 @@
             </w:pPr>
             <w:r>
               <w:rPr/>
-              <w:t>2.2.2026</w:t>
+              <w:t>layout left</w:t>
             </w:r>
           </w:p>
         </w:tc>
         <w:tc>
           <w:tcPr>
-            <w:tcW w:w="6480" w:type="dxa"/>
+            <w:tcW w:w="4820" w:type="dxa"/>
             <w:tcBorders/>
           </w:tcPr>
           <w:p>
             <w:pPr>
               <w:pStyle w:val="Normal"/>
               <w:bidi w:val="0"/>
-              <w:jc w:val="end"/>
+              <w:jc w:val="start"/>
               <w:rPr/>
             </w:pPr>
             <w:r>
               <w:rPr/>
-              <w:t>250.50</w:t>
+              <w:t>layout right</w:t>
             </w:r>
           </w:p>
         </w:tc>

</xml_diff>

<commit_message>
Word documents: highlight, fixed line heights, paragraph borders
- Model: RichTextRun::highlightColor; RichDocBlock::lineHeightPt,
  lineHeightAtLeast, paragraphBorder*/paragraphBackground.
- ODT, DOCX (w:highlight, w:shd, w:pBdr, exact/atLeast spacing, style
  chain) and DOC (sprmCHighlight, character/paragraph shading, sprmPBrc*,
  LSPD exact/at-least) readers fill them. A cell's paragraph frame fills
  the sides the cell leaves open.
- UltraCanvasRichTextEdit draws highlight, absolute line heights and
  paragraph frames (grouped boxes, frame room added to the spacing).
- ODT/DOCX writers and HTML output carry them; DOCX run properties are now
  written in CT_RPr order.
- Fixture gains highlight, exact/at-least lines, a two-paragraph box and a
  rule above a paragraph.

Co-Authored-By: Claude Opus 5.5 <noreply@anthropic.com>
Claude-Session: https://claude.ai/code/session_01XRKLeqdGGwmZ4Cgz4KJXAZ
</commit_message>
<xml_diff>
--- a/Tests/fixtures/word97-formatting.docx
+++ b/Tests/fixtures/word97-formatting.docx
@@ -897,6 +897,107 @@
       <w:r>
         <w:rPr/>
         <w:t xml:space="preserve"> symbols</w:t>
+      </w:r>
+    </w:p>
+    <w:p>
+      <w:pPr>
+        <w:pStyle w:val="Normal"/>
+        <w:bidi w:val="0"/>
+        <w:jc w:val="start"/>
+        <w:rPr/>
+      </w:pPr>
+      <w:r>
+        <w:rPr/>
+        <w:t xml:space="preserve">A </w:t>
+      </w:r>
+      <w:r>
+        <w:rPr>
+          <w:shd w:fill="FFFF00" w:val="clear"/>
+        </w:rPr>
+        <w:t>marked</w:t>
+      </w:r>
+      <w:r>
+        <w:rPr/>
+        <w:t xml:space="preserve"> word.</w:t>
+      </w:r>
+    </w:p>
+    <w:p>
+      <w:pPr>
+        <w:pStyle w:val="Normal"/>
+        <w:bidi w:val="0"/>
+        <w:spacing w:lineRule="exact" w:line="400"/>
+        <w:jc w:val="start"/>
+        <w:rPr/>
+      </w:pPr>
+      <w:r>
+        <w:rPr/>
+        <w:t>fixed height line</w:t>
+      </w:r>
+    </w:p>
+    <w:p>
+      <w:pPr>
+        <w:pStyle w:val="Normal"/>
+        <w:bidi w:val="0"/>
+        <w:spacing w:lineRule="atLeast" w:line="360"/>
+        <w:jc w:val="start"/>
+        <w:rPr/>
+      </w:pPr>
+      <w:r>
+        <w:rPr/>
+        <w:t>at least height line</w:t>
+      </w:r>
+    </w:p>
+    <w:p>
+      <w:pPr>
+        <w:pStyle w:val="Normal"/>
+        <w:pBdr>
+          <w:top w:val="single" w:sz="4" w:space="4" w:color="000000"/>
+          <w:left w:val="single" w:sz="4" w:space="4" w:color="000000"/>
+          <w:bottom w:val="single" w:sz="4" w:space="4" w:color="000000"/>
+          <w:right w:val="single" w:sz="4" w:space="4" w:color="000000"/>
+        </w:pBdr>
+        <w:shd w:fill="EEEEEE" w:val="clear"/>
+        <w:bidi w:val="0"/>
+        <w:jc w:val="start"/>
+        <w:rPr/>
+      </w:pPr>
+      <w:r>
+        <w:rPr/>
+        <w:t>boxed one</w:t>
+      </w:r>
+    </w:p>
+    <w:p>
+      <w:pPr>
+        <w:pStyle w:val="Normal"/>
+        <w:pBdr>
+          <w:top w:val="single" w:sz="4" w:space="4" w:color="000000"/>
+          <w:left w:val="single" w:sz="4" w:space="4" w:color="000000"/>
+          <w:bottom w:val="single" w:sz="4" w:space="4" w:color="000000"/>
+          <w:right w:val="single" w:sz="4" w:space="4" w:color="000000"/>
+        </w:pBdr>
+        <w:shd w:fill="EEEEEE" w:val="clear"/>
+        <w:bidi w:val="0"/>
+        <w:jc w:val="start"/>
+        <w:rPr/>
+      </w:pPr>
+      <w:r>
+        <w:rPr/>
+        <w:t>boxed two</w:t>
+      </w:r>
+    </w:p>
+    <w:p>
+      <w:pPr>
+        <w:pStyle w:val="Normal"/>
+        <w:pBdr>
+          <w:top w:val="single" w:sz="8" w:space="2" w:color="808080"/>
+        </w:pBdr>
+        <w:bidi w:val="0"/>
+        <w:jc w:val="start"/>
+        <w:rPr/>
+      </w:pPr>
+      <w:r>
+        <w:rPr/>
+        <w:t>ruled paragraph</w:t>
       </w:r>
       <w:r>
         <w:br w:type="page"/>

</xml_diff>